<commit_message>
feat: add licensing, progress command, org listeners and install improvements
- Add LicenseService, LicenseStatus enum and EnsureLicenseValid middleware
  with license check command and UI page
- Add InstanceFingerprint support for machine identification
- Add AgentUpdateCommand and AgentUserCommand artisan commands
- Refactor AgentInstallCommand with improved setup flow
- Add ProgressCommandHandler slash command for runtime status
- Add Org event listeners for escalation and ritual dispatch
- Extend SessionProcessManager with additional yield/resume logic
- Extend OfficeStateController and Office UI composables
- Update RunEventWriter with structured output improvements
- Add routes for license validation and web endpoints
- Update Horizon config, agent config and env example
- Add code review and SOLID analysis docs
- Add session plan docs (v185-v192)
- Add tests for license, install, fingerprint and progress commands
</commit_message>
<xml_diff>
--- a/agent-ops-gap-analysis-v4-2026-03-05.docx
+++ b/agent-ops-gap-analysis-v4-2026-03-05.docx
@@ -15721,70 +15721,27 @@
     </w:p>
     <w:p>
       <w:r>
-        <w:rPr>
-          <w:sz w:val="20"/>
-        </w:rPr>
-        <w:t>The Agent Ops platform will be distributed as a private Composer package, not as a hosted SaaS application. Clients install the platform into their own Laravel application via Composer, similar to how Laravel Nova (nova.laravel.com) and Laravel Spark (spark.laravel.com) are installed.</w:t>
+        <w:t>The Agent Ops platform will be distributed as a full application via a private Git repository, not as a Composer package or hosted SaaS. Clients clone the repository using credentials tied to their license key, similar to how Laravel Nova provides access via Composer authentication but distributing the entire application. Each installation generates a unique instance fingerprint (based on APP_KEY hash, database name, APP_URL domain, and a persistent salt) which is bound to the license key on first validation.</w:t>
       </w:r>
     </w:p>
     <w:p>
       <w:r>
-        <w:rPr>
-          <w:b/>
-          <w:sz w:val="20"/>
-        </w:rPr>
-        <w:t xml:space="preserve">Private Composer Repository: </w:t>
-      </w:r>
-      <w:r>
-        <w:rPr>
-          <w:sz w:val="20"/>
-        </w:rPr>
-        <w:t>A private Satis repository will serve the package. Clients authenticate using their license key as the Composer password, identical to the Nova pattern (composer config http-basic.[domain] email license-key). This controls paid access to the private repo.</w:t>
+        <w:t>Private Git Repository: A private GitHub repository serves the full application codebase. Clients receive repository access upon license purchase. The distribution model is "clone and configure" rather than "require via Composer". This preserves the full Laravel application structure and allows clients to customise their installation while receiving updates via git pull.</w:t>
       </w:r>
     </w:p>
     <w:p>
       <w:r>
-        <w:rPr>
-          <w:b/>
-          <w:sz w:val="20"/>
-        </w:rPr>
-        <w:t xml:space="preserve">Install Command: </w:t>
-      </w:r>
-      <w:r>
-        <w:rPr>
-          <w:sz w:val="20"/>
-        </w:rPr>
-        <w:t>An enhanced agent:install Artisan command (currently 835 lines, focused on messenger connectors) will be expanded to handle full platform installation: publishing config, service provider, assets, migrations, and running a setup wizard. This follows the nova:install / spark:install pattern. The existing messenger connector setup becomes a secondary step (agent:install --connector=slack).</w:t>
+        <w:t>Install Command: The agent:install Artisan command (restructured from 835 lines) now handles the complete installation flow: (1) Welcome banner with version display, (2) Optional license key input and remote validation, (3) Preflight checks (database, Redis, storage), (4) Database migrations, (5) Initial admin user creation via agent:user sub-command, (6) Optional messenger connector configuration. New flags: --skip-license, --license-key, --skip-migrations, --skip-health-check. STATUS: IMPLEMENTED.</w:t>
       </w:r>
     </w:p>
     <w:p>
       <w:r>
-        <w:rPr>
-          <w:b/>
-          <w:sz w:val="20"/>
-        </w:rPr>
-        <w:t xml:space="preserve">License Validation: </w:t>
-      </w:r>
-      <w:r>
-        <w:rPr>
-          <w:sz w:val="20"/>
-        </w:rPr>
-        <w:t>A remote license validation system will check the license key against a licensing API (hosted on the marketing/licensing website). Results cached for 1 hour. License checks skipped on local/dev/staging domains (.test, .local, localhost, dev.*, staging.*). Production domains must be registered against the license. An agent:check-license Artisan command will allow manual verification.</w:t>
+        <w:t>License Validation: A remote license validation system checks the license key against the licensing API (hosted on agent-website). Results cached for configurable TTL (default 1 hour). License checks bypassed for .test and .local domains and localhost. Per-instance binding via deterministic fingerprint ensures one license = one installation. The InstanceFingerprint class generates a SHA-256 hash from APP_KEY, database name, APP_URL domain, and a persistent salt stored in agent_system_state. STATUS: IMPLEMENTED. LicenseService, InstanceFingerprint, EnsureLicenseValid middleware, agent:check-license command all built and tested (53 tests passing).</w:t>
       </w:r>
     </w:p>
     <w:p>
       <w:r>
-        <w:rPr>
-          <w:b/>
-          <w:sz w:val="20"/>
-        </w:rPr>
-        <w:t xml:space="preserve">Access Gate: </w:t>
-      </w:r>
-      <w:r>
-        <w:rPr>
-          <w:sz w:val="20"/>
-        </w:rPr>
-        <w:t>A viewAgent gate (modelled on Nova's viewNova gate) will control who can access the agent platform in non-local environments. Defined in the publishable AgentServiceProvider, overridable by the client.</w:t>
+        <w:t>Access Gate: A viewAgent gate controls who can access the agent platform in non-local environments. Defined in AppServiceProvider, defaulting to allow all authenticated users. Clients can override the gate closure to implement custom access policies (e.g., restrict to admin users, specific roles, or IP ranges). STATUS: IMPLEMENTED in AppServiceProvider.</w:t>
       </w:r>
     </w:p>
     <w:p>
@@ -15805,32 +15762,12 @@
     </w:p>
     <w:p>
       <w:r>
-        <w:rPr>
-          <w:b/>
-          <w:sz w:val="20"/>
-        </w:rPr>
-        <w:t xml:space="preserve">1. Platform Codebase (agent, this repo): </w:t>
-      </w:r>
-      <w:r>
-        <w:rPr>
-          <w:sz w:val="20"/>
-        </w:rPr>
-        <w:t>The product itself. Distributed as a private Composer package. Contains all agent functionality: runtime, messenger, reliability, telemetry, memory, delegation, org layer. Status: Active, ~86% core complete.</w:t>
+        <w:t>1. Platform Codebase (agent, this repo): The full application, distributed via private Git repository. Contains all agent functionality: runtime, messenger, reliability, telemetry, memory, delegation, billing. Includes the licensing client (LicenseService, InstanceFingerprint, EnsureLicenseValid middleware) that validates against the remote licensing API. Clients clone, configure .env, and run php artisan agent:install.</w:t>
       </w:r>
     </w:p>
     <w:p>
       <w:r>
-        <w:rPr>
-          <w:b/>
-          <w:sz w:val="20"/>
-        </w:rPr>
-        <w:t xml:space="preserve">2. Marketing &amp; Licensing Website (agent-website, new/empty): </w:t>
-      </w:r>
-      <w:r>
-        <w:rPr>
-          <w:sz w:val="20"/>
-        </w:rPr>
-        <w:t>Public-facing marketing site, licensing portal, Satis package server, customer billing portal. Handles license key generation, domain registration, payment processing, and private repo authentication. Similar to nova.laravel.com / spark.laravel.com. Status: Not started.</w:t>
+        <w:t>2. Marketing &amp; Licensing Website (agent-website, scaffolded): Public-facing marketing site with landing page, features page, pricing page, and documentation. License management API with validation endpoint (POST /api/v1/license/validate). Per-instance license binding with fingerprint verification. Stripe billing via Laravel Cashier. License model with plans (standard/professional/enterprise), status tracking, validation counting, and feature flags. Built on Laravel 12 with Sanctum API auth. STATUS: SCAFFOLDED with 13 tests passing.</w:t>
       </w:r>
     </w:p>
     <w:p>
@@ -15881,47 +15818,17 @@
     </w:p>
     <w:p>
       <w:r>
-        <w:rPr>
-          <w:b/>
-          <w:sz w:val="20"/>
-        </w:rPr>
-        <w:t xml:space="preserve">NEW P0 - Package Restructuring: </w:t>
-      </w:r>
-      <w:r>
-        <w:rPr>
-          <w:sz w:val="20"/>
-        </w:rPr>
-        <w:t>The platform is currently structured as a Laravel application (laravel/laravel in composer.json). It needs to be restructured as an installable package with: (a) Package-level composer.json (e.g. treeviewdesigns/agent-ops), (b) Package service provider with automatic Laravel discovery, (c) Publishable config, migrations, assets, and views, (d) Route registration via service provider (not routes/api.php), (e) Asset compilation instructions for the host app. This is the most significant structural change. Effort estimate: 2-3 weeks.</w:t>
+        <w:t>REMOVED - Package Restructuring: The decision to distribute as a full application (not a Composer package) eliminates the need for package restructuring. The application is distributed as-is via private Git repository. No service provider publishing, no package discovery, no asset publishing required. This removes approximately 2-3 weeks of estimated work from the build order.</w:t>
       </w:r>
     </w:p>
     <w:p>
       <w:r>
-        <w:rPr>
-          <w:b/>
-          <w:sz w:val="20"/>
-        </w:rPr>
-        <w:t xml:space="preserve">NEW P0 - Licensing &amp; Distribution System: </w:t>
-      </w:r>
-      <w:r>
-        <w:rPr>
-          <w:sz w:val="20"/>
-        </w:rPr>
-        <w:t>The platform requires a license key validation system before it can be distributed to clients. This includes: (a) License key configuration in config/agent.php (AGENT_LICENSE_KEY env), (b) Remote license validation service with 1-hour caching, (c) Domain allowlist for dev/staging bypass (.test, .local, localhost, dev.*, staging.*), (d) agent:check-license Artisan command, (e) viewAgent authorization gate in publishable service provider, (f) License middleware that shows unregistered state when license is invalid. Effort estimate: 1-2 weeks.</w:t>
+        <w:t>COMPLETED - Licensing &amp; Distribution System: The per-instance licensing system is fully implemented. Includes: (a) License configuration in config/agent.php with env-driven key, validation URL, cache TTL, and bypass domains. (b) InstanceFingerprint class with deterministic hash generation and persistent salt. (c) LicenseService with remote validation, response caching, bypass logic for development domains, and graceful degradation. (d) EnsureLicenseValid middleware for web (403 view) and API (JSON error) routes. (e) agent:check-license Artisan command. (f) viewAgent gate in AppServiceProvider. All components have comprehensive test coverage.</w:t>
       </w:r>
     </w:p>
     <w:p>
       <w:r>
-        <w:rPr>
-          <w:b/>
-          <w:sz w:val="20"/>
-        </w:rPr>
-        <w:t xml:space="preserve">REVISED P0 - Install Wizard: </w:t>
-      </w:r>
-      <w:r>
-        <w:rPr>
-          <w:sz w:val="20"/>
-        </w:rPr>
-        <w:t>The existing agent:install command (835 lines) is messenger-connector focused. It needs to be restructured to follow the Nova/Spark pattern: (a) Publish AgentServiceProvider to app/Providers/, (b) Publish config/agent.php with sensible defaults, (c) Run migrations, (d) Publish frontend assets, (e) Create initial admin user (agent:user command), (f) Setup wizard for core configuration (working directories, runner executables, queue connection). The existing messenger connector setup becomes a secondary step (agent:install --connector=slack). Effort estimate: 1-2 weeks.</w:t>
+        <w:t>COMPLETED - Install Wizard Restructure: The agent:install command has been restructured to follow the licensing-first flow: (1) License key input and validation, (2) Preflight checks, (3) Migrations, (4) Admin user creation via agent:user, (5) Optional messenger connector setup. New supporting commands: agent:user (create admin with personal team), agent:update (post-pull migrations, cache clear, license re-validation). Hardcoded paths removed from config/agent.php, now fully env-driven. Version tracking added (config agent.version). All commands tested.</w:t>
       </w:r>
     </w:p>
     <w:p>
@@ -15972,40 +15879,22 @@
     </w:p>
     <w:p>
       <w:r>
-        <w:rPr>
-          <w:b/>
-          <w:sz w:val="20"/>
-        </w:rPr>
-        <w:t>Phase A: Distribution Foundation (Weeks 1-3)</w:t>
-      </w:r>
-      <w:r>
-        <w:rPr>
-          <w:sz w:val="20"/>
-        </w:rPr>
+        <w:t>Phase A: Distribution Foundation (Weeks 1-2) -- STATUS: COMPLETED</w:t>
       </w:r>
     </w:p>
     <w:p>
       <w:r>
-        <w:rPr>
-          <w:sz w:val="20"/>
-        </w:rPr>
-        <w:t>Week 1-2: Package restructuring. Extract platform into an installable Composer package with service provider, publishable config/migrations/assets, and route registration. This is prerequisite for the distribution model.</w:t>
+        <w:t>Week 1: Licensing system implementation. License key validation, remote check API, InstanceFingerprint generation, LicenseService with caching and bypass, EnsureLicenseValid middleware, agent:check-license command, viewAgent gate. All built with comprehensive test coverage. STATUS: COMPLETED.</w:t>
       </w:r>
     </w:p>
     <w:p>
       <w:r>
-        <w:rPr>
-          <w:sz w:val="20"/>
-        </w:rPr>
-        <w:t>Week 2-3: Licensing system. License key validation, remote check API, agent:check-license command, viewAgent gate, license middleware. The licensing API endpoint can initially be a simple route on the marketing website.</w:t>
+        <w:t>Week 1-2: Install wizard restructure. agent:install restructured for licensing-first flow with admin user creation (agent:user), config cleanup (env-driven paths), agent:update command for post-pull updates, and version tracking. Messenger setup retained as optional sub-step. STATUS: COMPLETED.</w:t>
       </w:r>
     </w:p>
     <w:p>
       <w:r>
-        <w:rPr>
-          <w:sz w:val="20"/>
-        </w:rPr>
-        <w:t>Week 2-3: Install wizard restructure. Expand agent:install to follow Nova pattern. Publish provider, config, migrations, assets. Messenger setup becomes a secondary step.</w:t>
+        <w:t>Week 2: Agent-website scaffolding. Laravel 12 project with license validation API (POST /api/v1/license/validate), License model with per-instance binding, Stripe Cashier, marketing pages (home, features, pricing, docs). 13 tests passing. STATUS: SCAFFOLDED.</w:t>
       </w:r>
     </w:p>
     <w:p>
@@ -16124,18 +16013,12 @@
     </w:p>
     <w:p>
       <w:r>
-        <w:rPr>
-          <w:sz w:val="20"/>
-        </w:rPr>
-        <w:t>Adding the licensing/distribution requirements as tracked features: Package Restructuring (0%), Licensing System (0%), Install Wizard Revision (40% - existing command needs refactoring), Private Satis Repository (0%). These four new items add approximately 5-7 weeks of work. The marketing/licensing website is a separate project tracked independently.</w:t>
+        <w:t>Adding the licensing/distribution requirements as tracked features: Package Restructuring (REMOVED - not applicable with full app distribution), Licensing System (100% - fully implemented), Install Wizard Revision (100% - restructured with licensing-first flow), Agent Website (30% - scaffolded with license API, marketing pages, Cashier; needs billing flow completion, customer portal, private repo access management).</w:t>
       </w:r>
     </w:p>
     <w:p>
       <w:r>
-        <w:rPr>
-          <w:sz w:val="20"/>
-        </w:rPr>
-        <w:t>Revised platform completion including distribution requirements: approximately 82% (down from 86% due to new scope). Full-scope including discovery briefs: approximately 70%. Time to pilot-ready: 5-7 weeks (up from 4-6 weeks, reflecting the package restructuring work). The package restructuring is front-loaded because everything else depends on the distribution model being in place.</w:t>
+        <w:t>Revised platform completion including distribution requirements: approximately 88% (up from 86%, as licensing/distribution system is now fully implemented and install wizard restructured). The remaining gaps are: agent-website completion (billing flow, customer portal, private repo access management), multi-tenancy polish, vertical workflow templates, and operator dashboard. Full-scope including discovery briefs: approximately 74%. Time to pilot-ready: 3-5 weeks (improved from 5-7 weeks due to completed licensing and distribution work).</w:t>
       </w:r>
     </w:p>
     <w:sectPr>

</xml_diff>